<commit_message>
Actualiza DESIGN.docx, DESIGN.pdf, index.html y elimina copia
</commit_message>
<xml_diff>
--- a/DESIGN.docx
+++ b/DESIGN.docx
@@ -575,6 +575,14 @@
         </w:rPr>
         <w:t xml:space="preserve"> mi color secundario para jerarquías y acciones complementarias. Lo utilizo en subtítulos, enlaces secundarios, botones secundarios, etiquetas y elementos interactivos que no requieren la misma prioridad visual que un CTA principal. También funciona como color de apoyo para mantener el equilibrio frente al rojo.</w:t>
       </w:r>
+      <w:r>
+        <w:rPr>
+          <w:rFonts w:ascii="Arial" w:hAnsi="Arial" w:cs="Arial"/>
+          <w:sz w:val="22"/>
+          <w:szCs w:val="22"/>
+        </w:rPr>
+        <w:t xml:space="preserve"> </w:t>
+      </w:r>
     </w:p>
     <w:p>
       <w:pPr>
@@ -878,15 +886,55 @@
           <w:szCs w:val="22"/>
         </w:rPr>
         <w:lastRenderedPageBreak/>
-        <w:t>E</w:t>
-      </w:r>
-      <w:r>
-        <w:rPr>
-          <w:rFonts w:ascii="Arial" w:hAnsi="Arial" w:cs="Arial"/>
-          <w:sz w:val="22"/>
-          <w:szCs w:val="22"/>
-        </w:rPr>
-        <w:t>l título display va en Quimby Gobernatorial a 64px, utilizado principalmente para el nombre de la marca y los titulares de mayor impacto. Los títulos 1 van en Quimby Gobernatorial a 48px, para los encabezados principales de cada sección. Los títulos 2 van en Quimby Gobernatorial a 40px, para secciones secundarias. Los subtítulos van en Acumin Variable Concept Bold Italic a 24px. El cuerpo de texto va en Acumin Variable Concept Regular a 16px, con un interlineado de 24px. Los ítems de lista van en Acumin Variable Concept Regular a 16px. El texto pequeño va en Acumin Variable Concept Regular a 14px. La etiqueta de los botones y CTA va en Acumin Variable Concept Bold a 16px. Y los enlaces van en Acumin Variable Concept Bold a 16px.</w:t>
+        <w:t xml:space="preserve">El título display va en Quimby </w:t>
+      </w:r>
+      <w:r>
+        <w:rPr>
+          <w:rFonts w:ascii="Arial" w:hAnsi="Arial" w:cs="Arial"/>
+          <w:sz w:val="22"/>
+          <w:szCs w:val="22"/>
+        </w:rPr>
+        <w:t xml:space="preserve">Mayoral </w:t>
+      </w:r>
+      <w:r>
+        <w:rPr>
+          <w:rFonts w:ascii="Arial" w:hAnsi="Arial" w:cs="Arial"/>
+          <w:sz w:val="22"/>
+          <w:szCs w:val="22"/>
+        </w:rPr>
+        <w:t>a 64px, utilizado principalmente para el nombre de la marca y los titulares de mayor impacto. Los títulos 1 van en Quimby Gobernatorial a 48px, para los encabezados principales de cada sección. Los títulos 2 van en Quimby Gobernatorial a 40px, para secciones secundarias. Los subtítulos van en Acumin Variable Concept Bold Italic a 24px. El cuerpo de texto va en Acumin Variable Concept Regular a 16px, con un interlineado de 24px. Los ítems de lista van en Acumin Variable Concept Regular a 1</w:t>
+      </w:r>
+      <w:r>
+        <w:rPr>
+          <w:rFonts w:ascii="Arial" w:hAnsi="Arial" w:cs="Arial"/>
+          <w:sz w:val="22"/>
+          <w:szCs w:val="22"/>
+        </w:rPr>
+        <w:t>8</w:t>
+      </w:r>
+      <w:r>
+        <w:rPr>
+          <w:rFonts w:ascii="Arial" w:hAnsi="Arial" w:cs="Arial"/>
+          <w:sz w:val="22"/>
+          <w:szCs w:val="22"/>
+        </w:rPr>
+        <w:t>px. El texto pequeño va en Acumin Variable Concept Regular a 14px. La etiqueta de los botones y CTA va en Acumin Variable Concept Bold a 1</w:t>
+      </w:r>
+      <w:r>
+        <w:rPr>
+          <w:rFonts w:ascii="Arial" w:hAnsi="Arial" w:cs="Arial"/>
+          <w:sz w:val="22"/>
+          <w:szCs w:val="22"/>
+        </w:rPr>
+        <w:t>8</w:t>
+      </w:r>
+      <w:r>
+        <w:rPr>
+          <w:rFonts w:ascii="Arial" w:hAnsi="Arial" w:cs="Arial"/>
+          <w:sz w:val="22"/>
+          <w:szCs w:val="22"/>
+        </w:rPr>
+        <w:t>px. Y los enlaces van en Acumin Variable Concept Bold a 16px.</w:t>
       </w:r>
     </w:p>
     <w:p>

</xml_diff>